<commit_message>
Corregir dueño y personal de Luna de Cristal en todos los archivos
Co-Authored-By: Claude Opus 5.5 <noreply@anthropic.com>
Claude-Session: https://claude.ai/code/session_01P9bj8o7UcwbCu86Zsog7Lb
</commit_message>
<xml_diff>
--- a/Actividad Alva instructora Luna de Cristal/3_Paso3_Respuestas_argumentadas.docx
+++ b/Actividad Alva instructora Luna de Cristal/3_Paso3_Respuestas_argumentadas.docx
@@ -157,7 +157,7 @@
           <w:sz w:val="18"/>
           <w:szCs w:val="18"/>
         </w:rPr>
-        <w:t xml:space="preserve">Fuente: informe "Portafolio digital para la intervención de procesos administrativos con enfoque de innovación en la empresa Luna de Cristal" (fase de planeación, 2026): entrevista a la propietaria (24/06/2026), encuesta a 2 colaboradores, 45 clientas y 5 proveedores.</w:t>
+        <w:t xml:space="preserve">Fuente: informe "Portafolio digital para la intervención de procesos administrativos con enfoque de innovación en la empresa Luna de Cristal" (fase de planeación, 2026): entrevista a la dirección del negocio (24/06/2026), encuesta a 2 colaboradores, 45 clientas y 5 proveedores.</w:t>
       </w:r>
     </w:p>
     <w:p>
@@ -175,7 +175,7 @@
         <w:jc w:val="both"/>
       </w:pPr>
       <w:r>
-        <w:t xml:space="preserve">Luna de Cristal tiene clientas satisfechas: el 93,3 % de las encuestadas recomendaría la tienda y la propietaria destaca la calidad de sus productos. Aun así puede perder clientes, porque la calidad solo funciona si la gente conoce la tienda. La propietaria reconoce que el bajo alcance en redes sociales es uno de los factores que más la afecta, y el negocio no aparece en Google Maps. Hoy las clientas buscan en el celular antes de salir a comprar; si no encuentran la tienda, compran en almacenes con más trayectoria como Alta Moda o Dana's Closet.</w:t>
+        <w:t xml:space="preserve">Luna de Cristal tiene clientas satisfechas: el 93,3 % de las encuestadas recomendaría la tienda y la administradora destaca la calidad de sus productos. Aun así puede perder clientes, porque la calidad solo funciona si la gente conoce la tienda. La administradora reconoce que el bajo alcance en redes sociales es uno de los factores que más la afecta, y el negocio no aparece en Google Maps. Hoy las clientas buscan en el celular antes de salir a comprar; si no encuentran la tienda, compran en almacenes con más trayectoria como Alta Moda o Dana's Closet.</w:t>
       </w:r>
     </w:p>
     <w:p>
@@ -202,7 +202,7 @@
         <w:jc w:val="both"/>
       </w:pPr>
       <w:r>
-        <w:t xml:space="preserve">La creatividad es clave porque Luna de Cristal es una microempresa joven, con dos personas y recursos limitados. La creatividad permite encontrar soluciones con lo que ya se tiene. Por ejemplo, como las ventas se concentran en viernes, sábados y fechas especiales, se propone el "Jueves de Luna": un descuento solo para cinco prendas de baja rotación, que mueve un día flojo y libera inventario sin rebajar toda la tienda.</w:t>
+        <w:t xml:space="preserve">La creatividad es clave porque Luna de Cristal es una microempresa joven, con un equipo pequeño y recursos limitados. La creatividad permite encontrar soluciones con lo que ya se tiene. Por ejemplo, como las ventas se concentran en viernes, sábados y fechas especiales, se propone el "Jueves de Luna": un descuento solo para cinco prendas de baja rotación, que mueve un día flojo y libera inventario sin rebajar toda la tienda.</w:t>
       </w:r>
     </w:p>
     <w:p>
@@ -229,7 +229,7 @@
         <w:jc w:val="both"/>
       </w:pPr>
       <w:r>
-        <w:t xml:space="preserve">En lo administrativo, la innovación permite pasar del registro manual a herramientas digitales. Un portafolio digital, un sistema de inventario y, más adelante, un POS con facturación electrónica le darían a la propietaria información confiable sobre qué se vende, qué queda quieto y qué comprar. Esto fortalece las etapas de organización y control del proceso administrativo, que hoy son las más débiles.</w:t>
+        <w:t xml:space="preserve">En lo administrativo, la innovación permite pasar del registro manual a herramientas digitales. Un portafolio digital, un sistema de inventario y, más adelante, un POS con facturación electrónica le darían a la administradora información confiable sobre qué se vende, qué queda quieto y qué comprar. Esto fortalece las etapas de organización y control del proceso administrativo, que hoy son las más débiles.</w:t>
       </w:r>
     </w:p>
     <w:p>
@@ -256,7 +256,7 @@
         <w:jc w:val="both"/>
       </w:pPr>
       <w:r>
-        <w:t xml:space="preserve">Innovar un producto es cambiar lo que se vende. En Luna de Cristal sería ampliar la variedad de perfumes y correas, como pidió la propietaria, o crear los "Combos Hechizo" (prenda más perfume con un regalo).</w:t>
+        <w:t xml:space="preserve">Innovar un producto es cambiar lo que se vende. En Luna de Cristal sería ampliar la variedad de perfumes y correas, como pidió la administradora, o crear los "Combos Hechizo" (prenda más perfume con un regalo).</w:t>
       </w:r>
     </w:p>
     <w:p>

</xml_diff>